<commit_message>
docs: rewrite the approach document in first person around the intentional choices
The reviewer-facing docx read like a feature inventory in a disembodied
voice. Rewritten around the decisions and the reasoning, in Matthew's
voice: "AI extracts, code decides", failing gracefully promoted to a
named design principle (with its concrete behaviors), verify-first, and
offline-first. New sections tell the stories the repo actually contains:
the mis-tuned 7-wide/5s latency config owned as a mistake, the
title-case-vs-bold defect decision, the print-fidelity warning
re-render, and the bundled sample's post-ship live measurement including
the deliberately slow Reject path. Stale facts fixed along the way
(773 -> 779 tests, 21 -> 27 eval cases, demo references now Fireball,
Gemini model specifics dropped).

Co-Authored-By: Claude Fable 5 <noreply@anthropic.com>
</commit_message>
<xml_diff>
--- a/docs/TTB-Label-Verifier-Approach-and-Design.docx
+++ b/docs/TTB-Label-Verifier-Approach-and-Design.docx
@@ -30,7 +30,7 @@
           <w:sz w:val="26"/>
           <w:szCs w:val="26"/>
         </w:rPr>
-        <w:t xml:space="preserve">AI-Powered Alcohol Label Verification: Approach, Design Decisions, and Trade-offs</w:t>
+        <w:t xml:space="preserve">Checking alcohol labels against their applications: approach, design decisions, and trade-offs</w:t>
       </w:r>
     </w:p>
     <w:p>
@@ -67,7 +67,7 @@
         </w:rPr>
         <w:t xml:space="preserve">Live demo:  </w:t>
       </w:r>
-      <w:hyperlink w:history="1" r:id="rId8uqlitrodhefpte3eodo2">
+      <w:hyperlink w:history="1" r:id="rIdbrwdeswqwir4ysb_c1_pb">
         <w:r>
           <w:rPr>
             <w:rStyle w:val="Hyperlink"/>
@@ -91,7 +91,7 @@
         </w:rPr>
         <w:t xml:space="preserve">Source:  </w:t>
       </w:r>
-      <w:hyperlink w:history="1" r:id="rIddsnxi-rtp1240ysv_dyvy">
+      <w:hyperlink w:history="1" r:id="rIdxeoud0qs1fzkl2sxekrc1">
         <w:r>
           <w:rPr>
             <w:rStyle w:val="Hyperlink"/>
@@ -108,7 +108,7 @@
           <w:sz w:val="22"/>
           <w:szCs w:val="22"/>
         </w:rPr>
-        <w:t xml:space="preserve">  (README covers setup, architecture, and deployment)</w:t>
+        <w:t xml:space="preserve">  (the README covers setup, architecture, and deployment)</w:t>
       </w:r>
     </w:p>
     <w:p>
@@ -116,7 +116,7 @@
         <w:pStyle w:val="Heading1"/>
       </w:pPr>
       <w:r>
-        <w:t xml:space="preserve">1.  Executive summary</w:t>
+        <w:t xml:space="preserve">1.  What this is</w:t>
       </w:r>
     </w:p>
     <w:p>
@@ -128,7 +128,7 @@
           <w:sz w:val="22"/>
           <w:szCs w:val="22"/>
         </w:rPr>
-        <w:t xml:space="preserve">The TTB Label Verifier reads photographs of alcohol beverage labels with a vision model and verifies them against the application the way a compliance agent does: brand name matches, alcohol content is correct and within the class tolerance, net contents use an authorized standard of fill, and the government warning is present, verbatim, and correctly formatted. It returns a clear Approve, Needs review, or Reject verdict with a per-field breakdown, handles batch uploads of hundreds of labels as a streaming, reviewable worklist, and exports JSON and CSV records of every decision.</w:t>
+        <w:t xml:space="preserve">A compliance agent uploads photos of an alcohol label. A vision model reads them, and the tool checks what is printed against what the application claims: the brand name, the alcohol content within the legal tolerance for its class, the net contents on an authorized standard of fill, and the government warning, verbatim and correctly formatted. The verdict is Approve, Needs review, or Reject, with a card for every field explaining how it was compared. The same engine runs a batch worklist for the 200-to-300-label dumps the discovery notes describe, and every read exports to JSON and CSV.</w:t>
       </w:r>
     </w:p>
     <w:p>
@@ -140,7 +140,7 @@
           <w:sz w:val="22"/>
           <w:szCs w:val="22"/>
         </w:rPr>
-        <w:t xml:space="preserve">Three numbers summarize the engineering posture. The automated suite (773 tests) runs offline in seconds with zero API keys, so every behavior is reproducible. The evaluation harness gates every commit on approve precision over 21 labeled cases with a hard floor of 98 percent, currently passing at 100 percent, because a false approval is the one error class this tool refuses to ship. And the deployed demo measured a median of 3.1 seconds end to end, inside the five second budget the Deputy Director named as the line between a tool agents use and one they abandon.</w:t>
+        <w:t xml:space="preserve">Three numbers I kept in front of me while building. The test suite (779 tests) runs offline in seconds with no API keys, so every behavior described here is reproducible on a laptop. The evaluation harness gates every commit on approve precision over 27 labeled cases with a hard floor of 98 percent, because a false approval is the one error I decided this tool would not ship. And the deployed demo measured a median of 3.1 seconds end to end against the five-second line the Deputy Director drew. Section 7 has the full measurement story, including the configuration mistake I found later and what it changed.</w:t>
       </w:r>
     </w:p>
     <w:p>
@@ -148,7 +148,7 @@
         <w:pStyle w:val="Heading1"/>
       </w:pPr>
       <w:r>
-        <w:t xml:space="preserve">2.  The core idea: AI extracts, code decides</w:t>
+        <w:t xml:space="preserve">2.  The choices I made on purpose</w:t>
       </w:r>
     </w:p>
     <w:p>
@@ -160,7 +160,15 @@
           <w:sz w:val="22"/>
           <w:szCs w:val="22"/>
         </w:rPr>
-        <w:t xml:space="preserve">Vision models are excellent readers and unreliable judges. The architecture therefore gives the model exactly one job: transcribe what is printed on the label into eighteen structured fields, each with a confidence score, plus four warning-format flags. Everything that decides is plain, deterministic, unit-tested code: pure comparators for the field-by-field match, a CFR-encoded completeness matrix for what each beverage class must carry, and statutory constants (the 27 CFR 16.21 warning text, tolerance bands, standards of fill) kept in one hand-verified module that tests are never allowed to retune.</w:t>
+        <w:t xml:space="preserve">A prototype like this can be a pile of features or a small set of decisions applied consistently. I tried to make it the second thing. These are the decisions, with the reasoning.</w:t>
+      </w:r>
+    </w:p>
+    <w:p>
+      <w:pPr>
+        <w:pStyle w:val="Heading2"/>
+      </w:pPr>
+      <w:r>
+        <w:t xml:space="preserve">AI extracts, code decides</w:t>
       </w:r>
     </w:p>
     <w:p>
@@ -172,7 +180,7 @@
           <w:sz w:val="22"/>
           <w:szCs w:val="22"/>
         </w:rPr>
-        <w:t xml:space="preserve">This split is what makes the tool defensible in a government context. When an agent asks why a label was rejected, the answer is a rule with a CFR citation, not a model's opinion. It also sets the safety bias: wherever the evidence is uncertain, the verdict routes to Needs review for a human. An unnecessary review costs minutes; a false approval costs trust in the entire system.</w:t>
+        <w:t xml:space="preserve">Vision models read well and judge unevenly, and in a compliance setting a judgment you cannot explain is worthless. So the model gets exactly one job: transcribe what is printed into eighteen structured fields and four warning-format flags, each with a confidence. Everything that decides is plain, unit-tested TypeScript: pure comparators for the field-by-field match, a completeness matrix encoding what each beverage class must carry, and the statutory constants (the 27 CFR 16.21 warning text, the tolerance bands, the standards of fill) in one hand-verified module. I do not let tests retune that module. If a test disagrees with the statute, the test is wrong.</w:t>
       </w:r>
     </w:p>
     <w:p>
@@ -184,15 +192,27 @@
           <w:sz w:val="22"/>
           <w:szCs w:val="22"/>
         </w:rPr>
-        <w:t xml:space="preserve">The screen itself is verify-first. The headline is the claimed-versus-label comparison, the brief's core check, computed once the application's required fields for the beverage type are supplied. The AI's reading pre-fills every input as a gray suggestion the agent can accept with Tab or one click, which is what kills the manual data entry without ever letting the model approve its own work.</w:t>
-      </w:r>
-    </w:p>
-    <w:p>
-      <w:pPr>
-        <w:pStyle w:val="Heading1"/>
-      </w:pPr>
-      <w:r>
-        <w:t xml:space="preserve">3.  What it does</w:t>
+        <w:t xml:space="preserve">The payoff is that when the tool rejects a label, the reason is a rule with a CFR citation. When an agent asks why, there is an answer.</w:t>
+      </w:r>
+    </w:p>
+    <w:p>
+      <w:pPr>
+        <w:pStyle w:val="Heading2"/>
+      </w:pPr>
+      <w:r>
+        <w:t xml:space="preserve">Failing gracefully</w:t>
+      </w:r>
+    </w:p>
+    <w:p>
+      <w:pPr>
+        <w:spacing w:after="140"/>
+      </w:pPr>
+      <w:r>
+        <w:rPr>
+          <w:sz w:val="22"/>
+          <w:szCs w:val="22"/>
+        </w:rPr>
+        <w:t xml:space="preserve">Jenny's line in the discovery notes, that badly photographed labels "should fail gracefully," shaped this design more than any other sentence in the brief. I read it as an error model, not a feature request about blurry photos. The version I held myself to: the tool is allowed to say it is not sure; it is never allowed to be silently wrong. Concretely:</w:t>
       </w:r>
     </w:p>
     <w:p>
@@ -206,21 +226,12 @@
       </w:pPr>
       <w:r>
         <w:rPr>
-          <w:b/>
-          <w:bCs/>
-          <w:sz w:val="22"/>
-          <w:szCs w:val="22"/>
-        </w:rPr>
-        <w:t xml:space="preserve">Single label.</w:t>
-      </w:r>
-      <w:r>
-        <w:rPr>
           <w:b w:val="false"/>
           <w:bCs w:val="false"/>
           <w:sz w:val="22"/>
           <w:szCs w:val="22"/>
         </w:rPr>
-        <w:t xml:space="preserve"> Drop one or several photos at once. Filenames like name-front and name-back place themselves into the Front, Back, and Neck slots; the rest fill open slots in order. The AI reads all images as one product, the application inputs pre-fill as suggestions, and the screen leads with Approve / Needs review / Reject plus a card per field explaining the comparison.</w:t>
+        <w:t xml:space="preserve">An unreadable photo gets a re-upload prompt. It never gets a fabricated verdict.</w:t>
       </w:r>
     </w:p>
     <w:p>
@@ -234,21 +245,12 @@
       </w:pPr>
       <w:r>
         <w:rPr>
-          <w:b/>
-          <w:bCs/>
-          <w:sz w:val="22"/>
-          <w:szCs w:val="22"/>
-        </w:rPr>
-        <w:t xml:space="preserve">Batch worklist.</w:t>
-      </w:r>
-      <w:r>
-        <w:rPr>
           <w:b w:val="false"/>
           <w:bCs w:val="false"/>
           <w:sz w:val="22"/>
           <w:szCs w:val="22"/>
         </w:rPr>
-        <w:t xml:space="preserve"> Drop hundreds of images. Fronts and backs pair by filename, an optional CSV supplies the application values, and rows stream in one by one behind thumbnails, triage chips, and an attention-first sort. Two rows that read the same brand offer a one-click, human-confirmed combine. A review drawer reproduces the full single-label review, including supplying application values in place, so a batch without a CSV is still fully workable.</w:t>
+        <w:t xml:space="preserve">If one of a product's images cannot be read (a dense back label is the slowest thing in the pipeline), the response names which image and why, both screens warn, and the verdict is capped at Needs review no matter how clean the surviving fields look. A dropped back label must never pass itself off as a clean front-only read.</w:t>
       </w:r>
     </w:p>
     <w:p>
@@ -262,21 +264,12 @@
       </w:pPr>
       <w:r>
         <w:rPr>
-          <w:b/>
-          <w:bCs/>
-          <w:sz w:val="22"/>
-          <w:szCs w:val="22"/>
-        </w:rPr>
-        <w:t xml:space="preserve">Resilience.</w:t>
-      </w:r>
-      <w:r>
-        <w:rPr>
           <w:b w:val="false"/>
           <w:bCs w:val="false"/>
           <w:sz w:val="22"/>
           <w:szCs w:val="22"/>
         </w:rPr>
-        <w:t xml:space="preserve"> Transient service failures retry automatically with jittered backoff and adaptive pacing, narrating each attempt on the row; persistent failures end in an honest error with one-click Retry. If one of a product's images cannot be read, the response says so, both screens warn, and a partial read can never headline Approve.</w:t>
+        <w:t xml:space="preserve">A field whose value matches the application but was read at low confidence shows "Match, confirm photo" rather than a green pass. The values agreeing is not the same thing as the photo being trustworthy.</w:t>
       </w:r>
     </w:p>
     <w:p>
@@ -290,21 +283,12 @@
       </w:pPr>
       <w:r>
         <w:rPr>
-          <w:b/>
-          <w:bCs/>
-          <w:sz w:val="22"/>
-          <w:szCs w:val="22"/>
-        </w:rPr>
-        <w:t xml:space="preserve">Human in the loop.</w:t>
-      </w:r>
-      <w:r>
-        <w:rPr>
           <w:b w:val="false"/>
           <w:bCs w:val="false"/>
           <w:sz w:val="22"/>
           <w:szCs w:val="22"/>
         </w:rPr>
-        <w:t xml:space="preserve"> Every flagged field carries confirm and flag controls with notes; decisions draft an applicant email; any edit or re-read invalidates stale confirmations so a recomputed verdict can never be force-passed by old state.</w:t>
+        <w:t xml:space="preserve">The bold-prefix check on the warning is tri-state. "Could not be verified" routes to review: the tool never claims a violation it cannot see, and never passes one it cannot rule out.</w:t>
       </w:r>
     </w:p>
     <w:p>
@@ -318,41 +302,12 @@
       </w:pPr>
       <w:r>
         <w:rPr>
-          <w:b/>
-          <w:bCs/>
-          <w:sz w:val="22"/>
-          <w:szCs w:val="22"/>
-        </w:rPr>
-        <w:t xml:space="preserve">Exports.</w:t>
-      </w:r>
-      <w:r>
-        <w:rPr>
           <w:b w:val="false"/>
           <w:bCs w:val="false"/>
           <w:sz w:val="22"/>
           <w:szCs w:val="22"/>
         </w:rPr>
-        <w:t xml:space="preserve"> JSON and RFC-4180 CSV carry the same field set, the verdict, the reviewer's decision, and the partial-read fact, so the saved record is the audit record.</w:t>
-      </w:r>
-    </w:p>
-    <w:p>
-      <w:pPr>
-        <w:pStyle w:val="Heading1"/>
-      </w:pPr>
-      <w:r>
-        <w:t xml:space="preserve">4.  Architecture and the reasoning behind it</w:t>
-      </w:r>
-    </w:p>
-    <w:p>
-      <w:pPr>
-        <w:spacing w:after="140"/>
-      </w:pPr>
-      <w:r>
-        <w:rPr>
-          <w:sz w:val="22"/>
-          <w:szCs w:val="22"/>
-        </w:rPr>
-        <w:t xml:space="preserve">The pipeline is image to provider(s) to reconciler to comparator to verdict, with each stage owning one safety property:</w:t>
+        <w:t xml:space="preserve">A container size that is not on the authorized list routes to review rather than fail, because TTB adds sizes from time to time and code should not hard-fail the law's future.</w:t>
       </w:r>
     </w:p>
     <w:p>
@@ -366,273 +321,64 @@
       </w:pPr>
       <w:r>
         <w:rPr>
-          <w:b/>
-          <w:bCs/>
-          <w:sz w:val="22"/>
-          <w:szCs w:val="22"/>
-        </w:rPr>
-        <w:t xml:space="preserve">Provider interface.</w:t>
-      </w:r>
-      <w:r>
-        <w:rPr>
           <w:b w:val="false"/>
           <w:bCs w:val="false"/>
           <w:sz w:val="22"/>
           <w:szCs w:val="22"/>
         </w:rPr>
-        <w:t xml:space="preserve"> Six interchangeable vision providers sit behind one interface: an offline mock (default; keys off the image filename so the whole suite is hermetic), OpenAI, Gemini, Azure OpenAI, Azure Document Intelligence OCR, and an ensemble mode that runs both Azure providers and routes their disagreement to review. Real providers use strict structured outputs, bounded retries that honor rate-limit headers, and self-limiting timeouts.</w:t>
-      </w:r>
-    </w:p>
-    <w:p>
-      <w:pPr>
-        <w:pStyle w:val="ListParagraph"/>
-        <w:numPr>
-          <w:ilvl w:val="0"/>
-          <w:numId w:val="2"/>
-        </w:numPr>
-        <w:spacing w:after="90"/>
-      </w:pPr>
-      <w:r>
-        <w:rPr>
-          <w:b/>
-          <w:bCs/>
-          <w:sz w:val="22"/>
-          <w:szCs w:val="22"/>
-        </w:rPr>
-        <w:t xml:space="preserve">Joint multi-image reads.</w:t>
-      </w:r>
-      <w:r>
-        <w:rPr>
-          <w:b w:val="false"/>
-          <w:bCs w:val="false"/>
-          <w:sz w:val="22"/>
-          <w:szCs w:val="22"/>
-        </w:rPr>
-        <w:t xml:space="preserve"> A product's images (front, back, neck) ride one request per sample as position-labeled, full-resolution parts, never a stitched composite: stitching halves each label's pixels under the vision APIs' total-resolution caps, exactly where the fine print lives. The model allocates fields with cross-panel context (brand on the front, warning on the back), and a two-image product pays per-sample requests, not images times samples. A model-reported front-versus-back conflict on a field is deterministically capped into the review band and made rescue-ineligible, so a cross-panel contradiction always reaches a human. Providers without joint reads (the offline mock, the Azure OCR path) keep per-image reads merged by code.</w:t>
-      </w:r>
-    </w:p>
-    <w:p>
-      <w:pPr>
-        <w:pStyle w:val="ListParagraph"/>
-        <w:numPr>
-          <w:ilvl w:val="0"/>
-          <w:numId w:val="2"/>
-        </w:numPr>
-        <w:spacing w:after="90"/>
-      </w:pPr>
-      <w:r>
-        <w:rPr>
-          <w:b/>
-          <w:bCs/>
-          <w:sz w:val="22"/>
-          <w:szCs w:val="22"/>
-        </w:rPr>
-        <w:t xml:space="preserve">Self-consistency voting.</w:t>
-      </w:r>
-      <w:r>
-        <w:rPr>
-          <w:b w:val="false"/>
-          <w:bCs w:val="false"/>
-          <w:sz w:val="22"/>
-          <w:szCs w:val="22"/>
-        </w:rPr>
-        <w:t xml:space="preserve"> Each product is read N times in parallel (each sample carrying all of its images) and per-field confidence is the agreement fraction across samples, which is far better calibrated than a model's self-reported confidence. The vote clusters cosmetic variance (a dropped cedilla is one reading) but never clusters numeric differences. A field most samples read identically but one sample dropped lands at 0.65, still gated to review but eligible for rescue; genuine splits stamp 0.3 and stay with a human.</w:t>
-      </w:r>
-    </w:p>
-    <w:p>
-      <w:pPr>
-        <w:pStyle w:val="ListParagraph"/>
-        <w:numPr>
-          <w:ilvl w:val="0"/>
-          <w:numId w:val="2"/>
-        </w:numPr>
-        <w:spacing w:after="90"/>
-      </w:pPr>
-      <w:r>
-        <w:rPr>
-          <w:b/>
-          <w:bCs/>
-          <w:sz w:val="22"/>
-          <w:szCs w:val="22"/>
-        </w:rPr>
-        <w:t xml:space="preserve">The warning judge.</w:t>
-      </w:r>
-      <w:r>
-        <w:rPr>
-          <w:b w:val="false"/>
-          <w:bCs w:val="false"/>
-          <w:sz w:val="22"/>
-          <w:szCs w:val="22"/>
-        </w:rPr>
-        <w:t xml:space="preserve"> Whether the GOVERNMENT WARNING: prefix is bold is the one check that can hard-fail a label, so a dedicated pass runs on the strongest available model (gpt-5.5 on the demo) and the result is tri-state: undetectable routes to review, never to a silent pass or a claimed violation.</w:t>
-      </w:r>
-    </w:p>
-    <w:p>
-      <w:pPr>
-        <w:pStyle w:val="ListParagraph"/>
-        <w:numPr>
-          <w:ilvl w:val="0"/>
-          <w:numId w:val="2"/>
-        </w:numPr>
-        <w:spacing w:after="90"/>
-      </w:pPr>
-      <w:r>
-        <w:rPr>
-          <w:b/>
-          <w:bCs/>
-          <w:sz w:val="22"/>
-          <w:szCs w:val="22"/>
-        </w:rPr>
-        <w:t xml:space="preserve">Low-confidence rescue.</w:t>
-      </w:r>
-      <w:r>
-        <w:rPr>
-          <w:b w:val="false"/>
-          <w:bCs w:val="false"/>
-          <w:sz w:val="22"/>
-          <w:szCs w:val="22"/>
-        </w:rPr>
-        <w:t xml:space="preserve"> When a verdict-relevant field stays under the 0.7 trust gate, one bounded call re-reads exactly those fields on the strong model. Cross-model agreement clears the false alarm; disagreement adopts the stronger reading but stays in review. A rescue can clear a false alarm; it can never flip a conflict to pass.</w:t>
-      </w:r>
-    </w:p>
-    <w:p>
-      <w:pPr>
-        <w:pStyle w:val="ListParagraph"/>
-        <w:numPr>
-          <w:ilvl w:val="0"/>
-          <w:numId w:val="2"/>
-        </w:numPr>
-        <w:spacing w:after="90"/>
-      </w:pPr>
-      <w:r>
-        <w:rPr>
-          <w:b/>
-          <w:bCs/>
-          <w:sz w:val="22"/>
-          <w:szCs w:val="22"/>
-        </w:rPr>
-        <w:t xml:space="preserve">Warning-focus escalation.</w:t>
-      </w:r>
-      <w:r>
-        <w:rPr>
-          <w:b w:val="false"/>
-          <w:bCs w:val="false"/>
-          <w:sz w:val="22"/>
-          <w:szCs w:val="22"/>
-        </w:rPr>
-        <w:t xml:space="preserve"> When the warning is required but still missing or format-unverified after the merge, judge, and rescue, one bounded strong-model pass locates it in any orientation (sideways and upside-down text are normal on bottles); plain code then crops the region, rotates it upright, and upscales it (sharp) so a second judgment reads the prefix strokes at several times the effective resolution. Asymmetric by design: a recovered warning surfaces at review-band confidence for a human, never as a silent pass, and a deliberate review hold is never overridden by the escalation's own agreement.</w:t>
-      </w:r>
-    </w:p>
-    <w:p>
-      <w:pPr>
-        <w:pStyle w:val="ListParagraph"/>
-        <w:numPr>
-          <w:ilvl w:val="0"/>
-          <w:numId w:val="2"/>
-        </w:numPr>
-        <w:spacing w:after="90"/>
-      </w:pPr>
-      <w:r>
-        <w:rPr>
-          <w:b/>
-          <w:bCs/>
-          <w:sz w:val="22"/>
-          <w:szCs w:val="22"/>
-        </w:rPr>
-        <w:t xml:space="preserve">Deterministic origin harvest.</w:t>
-      </w:r>
-      <w:r>
-        <w:rPr>
-          <w:b w:val="false"/>
-          <w:bCs w:val="false"/>
-          <w:sz w:val="22"/>
-          <w:szCs w:val="22"/>
-        </w:rPr>
-        <w:t xml:space="preserve"> Samples sometimes file a printed PRODUCT OF FRANCE under a sibling field. Plain code copies an origin statement that names a country into the empty origin field, with the source read's confidence. Code over already-read text, never another model call, and a region like Imported from the Caribbean never qualifies.</w:t>
-      </w:r>
-    </w:p>
-    <w:p>
-      <w:pPr>
-        <w:pStyle w:val="ListParagraph"/>
-        <w:numPr>
-          <w:ilvl w:val="0"/>
-          <w:numId w:val="2"/>
-        </w:numPr>
-        <w:spacing w:after="90"/>
-      </w:pPr>
-      <w:r>
-        <w:rPr>
-          <w:b/>
-          <w:bCs/>
-          <w:sz w:val="22"/>
-          <w:szCs w:val="22"/>
-        </w:rPr>
-        <w:t xml:space="preserve">Completeness engine.</w:t>
-      </w:r>
-      <w:r>
-        <w:rPr>
-          <w:b w:val="false"/>
-          <w:bCs w:val="false"/>
-          <w:sz w:val="22"/>
-          <w:szCs w:val="22"/>
-        </w:rPr>
-        <w:t xml:space="preserve"> Every TTB-mandatory element for the detected beverage class is checked as present, missing, malformed, or unverifiable, encoding the per-class nuance: malt ABV optional, the wine 14 percent table-wine carve-out, the under 0.5 percent warning exemption, sulfites conditional and surfaced rather than failed, and standards of fill that route unlisted sizes to review because TTB periodically adds sizes.</w:t>
-      </w:r>
-    </w:p>
-    <w:p>
-      <w:pPr>
-        <w:pStyle w:val="ListParagraph"/>
-        <w:numPr>
-          <w:ilvl w:val="0"/>
-          <w:numId w:val="2"/>
-        </w:numPr>
-        <w:spacing w:after="90"/>
-      </w:pPr>
-      <w:r>
-        <w:rPr>
-          <w:b/>
-          <w:bCs/>
-          <w:sz w:val="22"/>
-          <w:szCs w:val="22"/>
-        </w:rPr>
-        <w:t xml:space="preserve">Comparison engine.</w:t>
-      </w:r>
-      <w:r>
-        <w:rPr>
-          <w:b w:val="false"/>
-          <w:bCs w:val="false"/>
-          <w:sz w:val="22"/>
-          <w:szCs w:val="22"/>
-        </w:rPr>
-        <w:t xml:space="preserve"> Pure comparators biased to review. The headline verdict takes the worse of the comparison and the completeness check, so a label missing a mandatory element can never be auto-approved on a good match. Match is not compliance: a printed origin statement that matches the application verbatim but names a region instead of a country still routes to review.</w:t>
-      </w:r>
-    </w:p>
-    <w:p>
-      <w:pPr>
-        <w:pStyle w:val="ListParagraph"/>
-        <w:numPr>
-          <w:ilvl w:val="0"/>
-          <w:numId w:val="2"/>
-        </w:numPr>
-        <w:spacing w:after="90"/>
-      </w:pPr>
-      <w:r>
-        <w:rPr>
-          <w:b/>
-          <w:bCs/>
-          <w:sz w:val="22"/>
-          <w:szCs w:val="22"/>
-        </w:rPr>
-        <w:t xml:space="preserve">One verdict engine everywhere.</w:t>
-      </w:r>
-      <w:r>
-        <w:rPr>
-          <w:b w:val="false"/>
-          <w:bCs w:val="false"/>
-          <w:sz w:val="22"/>
-          <w:szCs w:val="22"/>
-        </w:rPr>
-        <w:t xml:space="preserve"> The evaluation harness, the single screen, and the batch worklist all read the same combined verdict derivation. There is no parallel UI verdict logic to drift.</w:t>
+        <w:t xml:space="preserve">In batch, a busy service retries with jittered backoff and the row narrates each attempt; when retries run out, the row says so and offers a Retry. Nothing fails silently and nothing disappears.</w:t>
+      </w:r>
+    </w:p>
+    <w:p>
+      <w:pPr>
+        <w:spacing w:after="140"/>
+      </w:pPr>
+      <w:r>
+        <w:rPr>
+          <w:sz w:val="22"/>
+          <w:szCs w:val="22"/>
+        </w:rPr>
+        <w:t xml:space="preserve">Under all of it is one asymmetry: an unnecessary review costs an agent a few minutes, while a false approval costs trust in the whole tool. The error budget is spent on the cheap error, and CI enforces that posture: the build fails if approve precision drops below 98 percent on the labeled cases.</w:t>
+      </w:r>
+    </w:p>
+    <w:p>
+      <w:pPr>
+        <w:pStyle w:val="Heading2"/>
+      </w:pPr>
+      <w:r>
+        <w:t xml:space="preserve">The application is the headline, not the AI</w:t>
+      </w:r>
+    </w:p>
+    <w:p>
+      <w:pPr>
+        <w:spacing w:after="140"/>
+      </w:pPr>
+      <w:r>
+        <w:rPr>
+          <w:sz w:val="22"/>
+          <w:szCs w:val="22"/>
+        </w:rPr>
+        <w:t xml:space="preserve">The brief's core check is label versus application, so that comparison leads the screen; the AI's field table is supporting material. The model's reading pre-fills every application input as a gray suggestion, accepted with Tab or one click, and that is what removes the manual data entry the agents complained about. But a suggestion only becomes part of the application when a person accepts it, so the model never approves its own work. The verdict waits until every field TTB requires for the beverage type is supplied, and the required set changes with the type: a malt beverage does not need an alcohol statement, spirits do.</w:t>
+      </w:r>
+    </w:p>
+    <w:p>
+      <w:pPr>
+        <w:pStyle w:val="Heading2"/>
+      </w:pPr>
+      <w:r>
+        <w:t xml:space="preserve">Offline by default</w:t>
+      </w:r>
+    </w:p>
+    <w:p>
+      <w:pPr>
+        <w:spacing w:after="140"/>
+      </w:pPr>
+      <w:r>
+        <w:rPr>
+          <w:sz w:val="22"/>
+          <w:szCs w:val="22"/>
+        </w:rPr>
+        <w:t xml:space="preserve">The default vision provider is an offline mock keyed to the bundled fixtures, which means the whole suite, the eval, and CI run deterministically with zero keys and no network. That choice cuts both ways and I accepted the cost: out of the box the app only recognizes the bundled samples, and the screen says so plainly. Reading arbitrary photos takes one environment variable and a key; the deployed demo runs that way.</w:t>
       </w:r>
     </w:p>
     <w:p>
@@ -640,7 +386,7 @@
         <w:pStyle w:val="Heading1"/>
       </w:pPr>
       <w:r>
-        <w:t xml:space="preserve">5.  Requirements traceability</w:t>
+        <w:t xml:space="preserve">3.  How the pipeline earns a verdict</w:t>
       </w:r>
     </w:p>
     <w:p>
@@ -652,7 +398,95 @@
           <w:sz w:val="22"/>
           <w:szCs w:val="22"/>
         </w:rPr>
-        <w:t xml:space="preserve">Each stakeholder concern from the discovery notes maps to a specific, testable behavior:</w:t>
+        <w:t xml:space="preserve">A product's images (front, back, and neck if there is one) ride a single request as position-labeled parts, so the model reads the panels with cross-panel context: brand on the front, warning on the back, one record out. I tested the obvious alternative, stitching the photos into one composite, and rejected it on measurement: the vision APIs cap total image resolution, so stitching halves each label's pixels exactly where the fine print lives. If the model reports that two panels contradict each other on a field, that field is pinned into the review band and made ineligible for every automatic recovery below. A cross-panel contradiction always reaches a person.</w:t>
+      </w:r>
+    </w:p>
+    <w:p>
+      <w:pPr>
+        <w:spacing w:after="140"/>
+      </w:pPr>
+      <w:r>
+        <w:rPr>
+          <w:sz w:val="22"/>
+          <w:szCs w:val="22"/>
+        </w:rPr>
+        <w:t xml:space="preserve">Each product is read several times, and a field's confidence is the fraction of samples that agree. I trust that number far more than a model's self-reported confidence. Cosmetic variation clusters as one reading; numeric differences never cluster.</w:t>
+      </w:r>
+    </w:p>
+    <w:p>
+      <w:pPr>
+        <w:spacing w:after="140"/>
+      </w:pPr>
+      <w:r>
+        <w:rPr>
+          <w:sz w:val="22"/>
+          <w:szCs w:val="22"/>
+        </w:rPr>
+        <w:t xml:space="preserve">Three escalations sit behind the vote. Each is bounded to one extra model call, and each is allowed to clear a false alarm but never to flip a conflict: a strong-model judge for the one check that can hard-fail a label (whether the GOVERNMENT WARNING: prefix is bold); a rescue that re-reads only the fields still under the 0.7 trust gate; and a warning-focus pass that locates the warning in any orientation, crops and upscales the region with plain image code, and re-judges from the zoom. A warning recovered this way surfaces at review confidence, never as a silent pass. The statutory text sits in every model's training data, so a transcription that merely matches it proves nothing by itself.</w:t>
+      </w:r>
+    </w:p>
+    <w:p>
+      <w:pPr>
+        <w:spacing w:after="140"/>
+      </w:pPr>
+      <w:r>
+        <w:rPr>
+          <w:sz w:val="22"/>
+          <w:szCs w:val="22"/>
+        </w:rPr>
+        <w:t xml:space="preserve">The last word belongs to deterministic code: the completeness check (every TTB-mandatory element for the class, scored present, missing, malformed, or unverifiable) and the comparators, with the headline verdict taking the worse of the two. Match is not compliance here. An origin statement that matches the application verbatim but names a region instead of a country still routes to review, because the marking rules require a country. And there is exactly one verdict derivation, shared by the eval harness, the single screen, and the batch worklist, so there is no second copy to drift.</w:t>
+      </w:r>
+    </w:p>
+    <w:p>
+      <w:pPr>
+        <w:pStyle w:val="Heading1"/>
+      </w:pPr>
+      <w:r>
+        <w:t xml:space="preserve">4.  The bundled sample, as an example of the posture</w:t>
+      </w:r>
+    </w:p>
+    <w:p>
+      <w:pPr>
+        <w:spacing w:after="140"/>
+      </w:pPr>
+      <w:r>
+        <w:rPr>
+          <w:sz w:val="22"/>
+          <w:szCs w:val="22"/>
+        </w:rPr>
+        <w:t xml:space="preserve">The verify screen's sample product is a real label (Fireball Cinnamon Whisky, from TTB's public COLA registry), a front and back pair placed into the slots with one click. It is an import on purpose: the back's importer line and PRODUCT OF CANADA statement exercise the origin rules end to end, and accepting the AI's suggestions walks the whole nine-field application to an Approve.</w:t>
+      </w:r>
+    </w:p>
+    <w:p>
+      <w:pPr>
+        <w:spacing w:after="140"/>
+      </w:pPr>
+      <w:r>
+        <w:rPr>
+          <w:sz w:val="22"/>
+          <w:szCs w:val="22"/>
+        </w:rPr>
+        <w:t xml:space="preserve">Two decisions about the defect variant say more about this project than a feature list would. First, the registry artwork is web resolution, and at that resolution the boldness of the warning prefix cannot be verified by any reader, human or model; the system answers "could not be verified" and routes to review, which is correct. Rather than let the demo pretend otherwise, the sample's warning block is re-rendered at print fidelity, and the two back variants differ only in the statutory variable. Second, my first defect was bold-versus-regular weight, and the live system kept routing it to review instead of rejecting. That is the conservative tri-state doing its job, and it makes a mushy demonstration. So the bundled defect prints "Government Warning:" in title case, the exact defect Jenny describes rejecting, which is judged from the transcript and fails deterministically. The real product's label is compliant, and every surface that mentions the variant says so.</w:t>
+      </w:r>
+    </w:p>
+    <w:p>
+      <w:pPr>
+        <w:pStyle w:val="Heading1"/>
+      </w:pPr>
+      <w:r>
+        <w:t xml:space="preserve">5.  What the stakeholders asked for</w:t>
+      </w:r>
+    </w:p>
+    <w:p>
+      <w:pPr>
+        <w:spacing w:after="140"/>
+      </w:pPr>
+      <w:r>
+        <w:rPr>
+          <w:sz w:val="22"/>
+          <w:szCs w:val="22"/>
+        </w:rPr>
+        <w:t xml:space="preserve">Each concern from the discovery notes maps to a specific, testable behavior:</w:t>
       </w:r>
     </w:p>
     <w:tbl>
@@ -1052,7 +886,7 @@
                 <w:sz w:val="20"/>
                 <w:szCs w:val="20"/>
               </w:rPr>
-              <w:t xml:space="preserve">Byte-for-byte comparison against the statutory 27 CFR 16.21 text (kept in one constant, guarded by a verbatim unit test), explicit all-caps and bold prefix checks, and a title-case demo label that reproduces her rejection.</w:t>
+              <w:t xml:space="preserve">Word-for-word comparison against the statutory 27 CFR 16.21 text (kept in one constant, guarded by a verbatim unit test), explicit all-caps and bold prefix checks, and the bundled defect sample reproduces her exact rejection: a title-case, regular-weight prefix.</w:t>
             </w:r>
           </w:p>
         </w:tc>
@@ -1116,7 +950,7 @@
                 <w:sz w:val="20"/>
                 <w:szCs w:val="20"/>
               </w:rPr>
-              <w:t xml:space="preserve">A readability gate routes unreadable photos to a re-upload prompt instead of a fabricated verdict; a dropped image in a multi-photo product is reported, warned about on both screens, and caps the verdict at review.</w:t>
+              <w:t xml:space="preserve">Taken as the error model for the whole tool; see section 2. Unreadable photos get a re-upload prompt, dropped images are reported and cap the verdict at review, and uncertainty routes to a person instead of a guess.</w:t>
             </w:r>
           </w:p>
         </w:tc>
@@ -1399,7 +1233,7 @@
                 <w:sz w:val="20"/>
                 <w:szCs w:val="20"/>
               </w:rPr>
-              <w:t xml:space="preserve">Demo: OpenAI gpt-4.1 extraction with a gpt-5.5 warning judge. Gemini path: 3.5-flash extraction, 3.1-pro judge. Production target: Azure OpenAI and Azure AI Document Intelligence. All behind one VisionProvider interface; the offline mock is the default.</w:t>
+              <w:t xml:space="preserve">Demo: OpenAI gpt-4.1 extraction with a gpt-5.5 warning judge; the Gemini path keeps the same split (the fast model transcribes, the strongest model judges). Production target: Azure OpenAI and Azure AI Document Intelligence. All behind one VisionProvider interface; the offline mock is the default.</w:t>
             </w:r>
           </w:p>
         </w:tc>
@@ -1463,7 +1297,7 @@
                 <w:sz w:val="20"/>
                 <w:szCs w:val="20"/>
               </w:rPr>
-              <w:t xml:space="preserve">Vitest (773 tests, offline), Testing Library for components, a tsx evaluation harness over 21 labeled fixtures acting as a CI gate, and live measurement scripts for deployed latency.</w:t>
+              <w:t xml:space="preserve">Vitest (779 tests, offline), Testing Library for components, a tsx evaluation harness over 27 labeled fixtures acting as a CI gate, and live measurement scripts for deployed latency.</w:t>
             </w:r>
           </w:p>
         </w:tc>
@@ -1550,7 +1384,7 @@
           <w:sz w:val="22"/>
           <w:szCs w:val="22"/>
         </w:rPr>
-        <w:t xml:space="preserve">Every performance and accuracy statement in this document traces to a dated measurement, and the project treats its own configuration the same way.</w:t>
+        <w:t xml:space="preserve">I held this document to a simple standard: a performance or accuracy claim either traces to a dated measurement, or it is not in here.</w:t>
       </w:r>
     </w:p>
     <w:p>
@@ -1564,12 +1398,21 @@
       </w:pPr>
       <w:r>
         <w:rPr>
+          <w:b/>
+          <w:bCs/>
+          <w:sz w:val="22"/>
+          <w:szCs w:val="22"/>
+        </w:rPr>
+        <w:t xml:space="preserve">Offline gate. </w:t>
+      </w:r>
+      <w:r>
+        <w:rPr>
           <w:b w:val="false"/>
           <w:bCs w:val="false"/>
           <w:sz w:val="22"/>
           <w:szCs w:val="22"/>
         </w:rPr>
-        <w:t>Offline gate: 773 tests in 60 files pass in seconds with no network. The eval harness scores 21 labeled cases (clean labels plus deliberate defects: a title-case warning, an out-of-tolerance ABV, a brand typo, a missing warning, an import without a country statement, an unreadable photo that must never auto-approve) at 100 percent accuracy, with the 98 percent approve-precision floor enforced in CI.</w:t>
+        <w:t xml:space="preserve">779 tests in 60 files pass in seconds with no network. The eval harness scores 27 labeled cases (clean labels plus deliberate defects: a title-case warning, an out-of-tolerance ABV, a brand typo, a missing warning, an import without a country statement, an unreadable photo that must never auto-approve) at 100 percent, with the 98 percent approve-precision floor enforced in CI.</w:t>
       </w:r>
     </w:p>
     <w:p>
@@ -1583,12 +1426,21 @@
       </w:pPr>
       <w:r>
         <w:rPr>
+          <w:b/>
+          <w:bCs/>
+          <w:sz w:val="22"/>
+          <w:szCs w:val="22"/>
+        </w:rPr>
+        <w:t xml:space="preserve">Live latency. </w:t>
+      </w:r>
+      <w:r>
+        <w:rPr>
           <w:b w:val="false"/>
           <w:bCs w:val="false"/>
           <w:sz w:val="22"/>
           <w:szCs w:val="22"/>
         </w:rPr>
-        <w:t>Live latency: 15 sequential reads against the deployed demo measured p50 3.1s and p95 5.2s with 15 of 15 verdicts correct; the one 5.2s read was the serverless cold start. Model selection was A/B measured the same way: the fast model transcribes and the strongest model judges, because moving extraction to the strong model doubled the median for identical verdicts.</w:t>
+        <w:t xml:space="preserve">15 sequential reads against the deployed demo measured p50 3.1s and p95 5.2s with 15 of 15 verdicts correct; the one 5.2s read was the serverless cold start (June 10). The model split was chosen by A/B measurement, not preference: moving extraction to the strong model doubled the median for identical verdicts, so the fast model transcribes and the strongest model judges.</w:t>
       </w:r>
     </w:p>
     <w:p>
@@ -1602,12 +1454,49 @@
       </w:pPr>
       <w:r>
         <w:rPr>
+          <w:b/>
+          <w:bCs/>
+          <w:sz w:val="22"/>
+          <w:szCs w:val="22"/>
+        </w:rPr>
+        <w:t xml:space="preserve">A mistake I want to own rather than bury. </w:t>
+      </w:r>
+      <w:r>
+        <w:rPr>
           <w:b w:val="false"/>
           <w:bCs w:val="false"/>
           <w:sz w:val="22"/>
           <w:szCs w:val="22"/>
         </w:rPr>
-        <w:t>An honest correction: that 3.1s pairing (a 7-wide vote under a 5 second per-sample cap) was measured on single-image demo labels, and a real front-plus-back product later exposed the gap: a dense, warning-bearing back label reads in about 5 seconds, so the cap could starve every sample of the back image. The pipeline now reports any dropped image end to end instead of proceeding silently, the verdict is capped at review on partial reads, and the recommended configuration is a 5-wide vote with an 8 second cap, re-measured reading the same dense pair completely in 4.9 seconds. The failure, the diagnosis, and the fix are documented in the repository because finding the measurement gap is part of the engineering.</w:t>
+        <w:t xml:space="preserve">That 3.1s configuration (a 7-wide vote under a 5 second per-sample cap) was tuned on single-image labels, and the numbers looked great because I had measured the easy case. A real front-plus-back product later exposed the gap: a dense, warning-bearing back label reads in about 5 seconds, so the cap could starve every sample of the back image, and at the time the pipeline would proceed silently on the front alone. The fix mattered more than the numbers: a dropped image is now reported end to end, a partial read caps the verdict at review, and the recommended pairing is a 5-wide vote with an 8 second cap, re-measured reading the same dense pair completely in 4.9 seconds. The failure and the diagnosis are documented in the repository, because finding the measurement gap is part of the engineering.</w:t>
+      </w:r>
+    </w:p>
+    <w:p>
+      <w:pPr>
+        <w:pStyle w:val="ListParagraph"/>
+        <w:numPr>
+          <w:ilvl w:val="0"/>
+          <w:numId w:val="2"/>
+        </w:numPr>
+        <w:spacing w:after="90"/>
+      </w:pPr>
+      <w:r>
+        <w:rPr>
+          <w:b/>
+          <w:bCs/>
+          <w:sz w:val="22"/>
+          <w:szCs w:val="22"/>
+        </w:rPr>
+        <w:t xml:space="preserve">The bundled sample, measured after it shipped (June 11). </w:t>
+      </w:r>
+      <w:r>
+        <w:rPr>
+          <w:b w:val="false"/>
+          <w:bCs w:val="false"/>
+          <w:sz w:val="22"/>
+          <w:szCs w:val="22"/>
+        </w:rPr>
+        <w:t xml:space="preserve">The clean pair read 3 for 3 Approve at 6.6 to 8.7 seconds; the defect pair read 3 for 3 Reject at 13 to 14 seconds. The defect is slower on purpose: before hard-failing a label, the warning escalation takes its careful zoomed look. I would rather publish the slow path than hide it.</w:t>
       </w:r>
     </w:p>
     <w:p>
@@ -1615,7 +1504,7 @@
         <w:pStyle w:val="Heading1"/>
       </w:pPr>
       <w:r>
-        <w:t xml:space="preserve">8.  Assumptions</w:t>
+        <w:t xml:space="preserve">8.  What I deliberately did not build</w:t>
       </w:r>
     </w:p>
     <w:p>
@@ -1634,7 +1523,7 @@
           <w:sz w:val="22"/>
           <w:szCs w:val="22"/>
         </w:rPr>
-        <w:t xml:space="preserve">The application is the reference. The brief's core task is checking the label against the application, so the verdict waits until the application's required fields for the beverage type are supplied; the label reading and the completeness check always run and render regardless.</w:t>
+        <w:t xml:space="preserve">Image rectification. Badly photographed labels (angles, glare) get the re-upload prompt rather than deskewing. The brief says handling them is out of scope but failing well is not, and that is where the budget went; the self-consistency vote absorbs ordinary read noise.</w:t>
       </w:r>
     </w:p>
     <w:p>
@@ -1653,7 +1542,7 @@
           <w:sz w:val="22"/>
           <w:szCs w:val="22"/>
         </w:rPr>
-        <w:t xml:space="preserve">Azure is the production cloud (per the IT context), so the in-tenant providers are Azure-native; OpenAI and Gemini paths exist so the demo runs without an Azure resource. The interface keeps the choice swappable.</w:t>
+        <w:t xml:space="preserve">Physical-measurement rules. Type-size minimums and placement requirements (same field of vision, separate and apart) cannot be measured from extracted text, and I did not want to half-check them. They need layout-preserving OCR, which is the natural next provider capability.</w:t>
       </w:r>
     </w:p>
     <w:p>
@@ -1672,7 +1561,7 @@
           <w:sz w:val="22"/>
           <w:szCs w:val="22"/>
         </w:rPr>
-        <w:t xml:space="preserve">This is a standalone prototype: no COLA integration, no authentication, no PII storage, and nothing sensitive retained, per the stated scope.</w:t>
+        <w:t xml:space="preserve">Registry-backed checks. Formula approvals and permit matching need TTB records, not the label. Out of scope by design.</w:t>
       </w:r>
     </w:p>
     <w:p>
@@ -1691,7 +1580,7 @@
           <w:sz w:val="22"/>
           <w:szCs w:val="22"/>
         </w:rPr>
-        <w:t xml:space="preserve">The statutory warning text was re-verified against 27 CFR 16.21 in June 2026. The 2025 Surgeon General advisory is a proposal, not law; if the wording ever changes it is a one-constant edit guarded by a test, and a non-blocking note in the UI tracks pending proposals.</w:t>
+        <w:t xml:space="preserve">Authentication and rate limiting on the demo. Upload-size caps and bounded fan-out are enforced in the route, but per-client rate limiting belongs to an API gateway in production, not hand-rolled prototype code.</w:t>
       </w:r>
     </w:p>
     <w:p>
@@ -1710,15 +1599,7 @@
           <w:sz w:val="22"/>
           <w:szCs w:val="22"/>
         </w:rPr>
-        <w:t xml:space="preserve">Alcohol tolerances are selected per beverage class from the CFR (spirits, the wine 14 percent boundary rules, malt, cider by production method), with absolute boundary limits enforced separately from the symmetric band. Two judgment calls (cider classification, the unknown-class default to the tightest band) are flagged in code for verification before production use.</w:t>
-      </w:r>
-    </w:p>
-    <w:p>
-      <w:pPr>
-        <w:pStyle w:val="Heading1"/>
-      </w:pPr>
-      <w:r>
-        <w:t xml:space="preserve">9.  Trade-offs and limitations</w:t>
+        <w:t xml:space="preserve">A second opinion on the statutes. The warning text was re-verified against 27 CFR 16.21 in June 2026; the 2025 Surgeon General advisory is a proposal, not law. If the wording ever changes it is a one-constant edit guarded by a test, and a non-blocking note in the UI tracks the pending proposals. Two tolerance judgment calls (cider classification, the unknown-class default to the tightest band) are flagged in code for verification before production use.</w:t>
       </w:r>
     </w:p>
     <w:p>
@@ -1726,7 +1607,7 @@
         <w:pStyle w:val="ListParagraph"/>
         <w:numPr>
           <w:ilvl w:val="0"/>
-          <w:numId w:val="4"/>
+          <w:numId w:val="3"/>
         </w:numPr>
         <w:spacing w:after="90"/>
       </w:pPr>
@@ -1737,102 +1618,7 @@
           <w:sz w:val="22"/>
           <w:szCs w:val="22"/>
         </w:rPr>
-        <w:t xml:space="preserve">Offline-first cuts both ways. The default mock provider makes every test and CI run deterministic with zero keys, but out of the box it only recognizes the bundled sample labels; reading arbitrary photos requires configuring a real provider, as the deployed demo does. The demo screen says this plainly.</w:t>
-      </w:r>
-    </w:p>
-    <w:p>
-      <w:pPr>
-        <w:pStyle w:val="ListParagraph"/>
-        <w:numPr>
-          <w:ilvl w:val="0"/>
-          <w:numId w:val="4"/>
-        </w:numPr>
-        <w:spacing w:after="90"/>
-      </w:pPr>
-      <w:r>
-        <w:rPr>
-          <w:b w:val="false"/>
-          <w:bCs w:val="false"/>
-          <w:sz w:val="22"/>
-          <w:szCs w:val="22"/>
-        </w:rPr>
-        <w:t xml:space="preserve">No image rectification. Badly photographed labels (angles, glare) get a graceful re-upload prompt rather than deskewing, matching the brief's guidance that handling them is out of scope but failing well is not. The self-consistency vote absorbs ordinary read noise.</w:t>
-      </w:r>
-    </w:p>
-    <w:p>
-      <w:pPr>
-        <w:pStyle w:val="ListParagraph"/>
-        <w:numPr>
-          <w:ilvl w:val="0"/>
-          <w:numId w:val="4"/>
-        </w:numPr>
-        <w:spacing w:after="90"/>
-      </w:pPr>
-      <w:r>
-        <w:rPr>
-          <w:b w:val="false"/>
-          <w:bCs w:val="false"/>
-          <w:sz w:val="22"/>
-          <w:szCs w:val="22"/>
-        </w:rPr>
-        <w:t xml:space="preserve">No physical-measurement rules. Type-size minimums and layout placement requirements (same field of vision, separate and apart) cannot be measured from extracted text; checking them honestly needs layout-preserving OCR, which is noted as the natural next provider capability.</w:t>
-      </w:r>
-    </w:p>
-    <w:p>
-      <w:pPr>
-        <w:pStyle w:val="ListParagraph"/>
-        <w:numPr>
-          <w:ilvl w:val="0"/>
-          <w:numId w:val="4"/>
-        </w:numPr>
-        <w:spacing w:after="90"/>
-      </w:pPr>
-      <w:r>
-        <w:rPr>
-          <w:b w:val="false"/>
-          <w:bCs w:val="false"/>
-          <w:sz w:val="22"/>
-          <w:szCs w:val="22"/>
-        </w:rPr>
-        <w:t xml:space="preserve">No registry-backed checks. Formula approvals or permit matching need TTB records, not the label; they are out of scope by design.</w:t>
-      </w:r>
-    </w:p>
-    <w:p>
-      <w:pPr>
-        <w:pStyle w:val="ListParagraph"/>
-        <w:numPr>
-          <w:ilvl w:val="0"/>
-          <w:numId w:val="4"/>
-        </w:numPr>
-        <w:spacing w:after="90"/>
-      </w:pPr>
-      <w:r>
-        <w:rPr>
-          <w:b w:val="false"/>
-          <w:bCs w:val="false"/>
-          <w:sz w:val="22"/>
-          <w:szCs w:val="22"/>
-        </w:rPr>
-        <w:t xml:space="preserve">The demo endpoint is unauthenticated and unthrottled. Upload-size caps and bounded fan-out are enforced in the route, but per-client rate limiting belongs to an API gateway in production rather than hand-rolled prototype code.</w:t>
-      </w:r>
-    </w:p>
-    <w:p>
-      <w:pPr>
-        <w:pStyle w:val="ListParagraph"/>
-        <w:numPr>
-          <w:ilvl w:val="0"/>
-          <w:numId w:val="4"/>
-        </w:numPr>
-        <w:spacing w:after="90"/>
-      </w:pPr>
-      <w:r>
-        <w:rPr>
-          <w:b w:val="false"/>
-          <w:bCs w:val="false"/>
-          <w:sz w:val="22"/>
-          <w:szCs w:val="22"/>
-        </w:rPr>
-        <w:t xml:space="preserve">Confidence calibration is reported honestly: the Brier and ECE numbers from the offline harness calibrate the pipeline over fixtures, not a live model, and the documentation says so rather than implying more.</w:t>
+        <w:t xml:space="preserve">Inflated calibration claims. The Brier and ECE numbers from the offline harness calibrate the pipeline over its fixtures, not a live model, and the documentation says exactly that.</w:t>
       </w:r>
     </w:p>
     <w:p>
@@ -1840,7 +1626,7 @@
         <w:pStyle w:val="Heading1"/>
       </w:pPr>
       <w:r>
-        <w:t xml:space="preserve">10.  If this moved toward production</w:t>
+        <w:t xml:space="preserve">9.  If this moved toward production</w:t>
       </w:r>
     </w:p>
     <w:p>
@@ -1852,7 +1638,7 @@
           <w:sz w:val="22"/>
           <w:szCs w:val="22"/>
         </w:rPr>
-        <w:t xml:space="preserve">The first steps are deliberately boring: deploy the existing container in-tenant on Azure with provisioned model quota, put the endpoint behind the agency gateway for authentication and rate limiting, and turn on the opt-in escalation pass where accuracy on contested reads is worth the tail latency. After that: layout-preserving OCR to unlock the physical-measurement rules, a sampled human-audit loop over auto-approvals to keep measuring the false-approval rate in the field, and only then a conversation about COLA integration, which is an authorization and procurement problem more than a technical one.</w:t>
+        <w:t xml:space="preserve">The first steps are deliberately boring: deploy the existing container in-tenant on Azure with provisioned model quota, put the endpoint behind the agency gateway for authentication and rate limiting, and turn on the opt-in escalation pass where accuracy on contested reads is worth the tail latency. After that, layout-preserving OCR to unlock the physical-measurement rules, and a sampled human-audit loop over auto-approvals so the false-approval rate keeps getting measured in the field, not assumed. COLA integration comes last; it is an authorization and procurement question more than a technical one.</w:t>
       </w:r>
     </w:p>
     <w:p>
@@ -1864,7 +1650,7 @@
           <w:sz w:val="22"/>
           <w:szCs w:val="22"/>
         </w:rPr>
-        <w:t xml:space="preserve">The prototype's job was to prove the shape: a tool fast enough that agents keep using it, honest enough that every verdict can be explained with a citation, and conservative enough that the errors it makes are the cheap kind. The measurements above are the evidence.</w:t>
+        <w:t xml:space="preserve">The prototype's job was to prove the shape, and the measurements above are the evidence I would offer.</w:t>
       </w:r>
     </w:p>
     <w:sectPr>
@@ -2138,12 +1924,6 @@
     </w:lvlOverride>
   </w:num>
   <w:num w:numId="3">
-    <w:abstractNumId w:val="3"/>
-    <w:lvlOverride w:ilvl="0">
-      <w:startOverride w:val="1"/>
-    </w:lvlOverride>
-  </w:num>
-  <w:num w:numId="4">
     <w:abstractNumId w:val="3"/>
     <w:lvlOverride w:ilvl="0">
       <w:startOverride w:val="1"/>

</xml_diff>

<commit_message>
docs: regenerate the approach document at three pages, four sections
The reviewer-facing docx/pdf rebuilt around the structure a reviewer
asked for: Summary, what the customers said they wanted, how I
implemented it, and why I chose this architecture (the AI models by
A/B measurement, Next.js, Vercel-for-demo vs Azure-for-production).
Exactly three pages, Word-verified, regenerated via
make-submission-doc.cjs per the never-hand-edit rule, with
TEST_COUNT synced to the suite the toggle commit measured (811 in 63
files).

A two-agent review pass shaped the text: an antithesis-density sweep
so it reads like a person, a fact-check that traced all 42 load-
bearing claims to the repo, the sample's six-to-nine-second live read
disclosed next to the 3.1s median, and Sarah's title aligned across
the spec and the doc (Deputy Director, per the committed stakeholder
table).

Co-Authored-By: Claude Fable 5 <noreply@anthropic.com>
</commit_message>
<xml_diff>
--- a/docs/TTB-Label-Verifier-Approach-and-Design.docx
+++ b/docs/TTB-Label-Verifier-Approach-and-Design.docx
@@ -53,7 +53,7 @@
         </w:rPr>
         <w:t xml:space="preserve">   ·   June 2026   ·   </w:t>
       </w:r>
-      <w:hyperlink w:history="1" r:id="rId-nqrkyjlsiesw-wjimek-">
+      <w:hyperlink w:history="1" r:id="rIdvjnumga1ib4dvctmolk-m">
         <w:r>
           <w:rPr>
             <w:rStyle w:val="Hyperlink"/>
@@ -70,7 +70,7 @@
         </w:rPr>
         <w:t xml:space="preserve">   ·   </w:t>
       </w:r>
-      <w:hyperlink w:history="1" r:id="rIdfho8yeh5tnbpjrt-ygaog">
+      <w:hyperlink w:history="1" r:id="rIdl1az2_iqc3niritsfjg7q">
         <w:r>
           <w:rPr>
             <w:rStyle w:val="Hyperlink"/>
@@ -110,7 +110,7 @@
           <w:sz w:val="22"/>
           <w:szCs w:val="22"/>
         </w:rPr>
-        <w:t xml:space="preserve">One asymmetry runs through the whole design: an unnecessary review costs an agent a few minutes, while a false approval costs trust in the tool. So uncertainty always routes to a person, and the build fails if approve precision drops below 98 percent on the labeled evaluation cases. The numbers I held myself to: 810 tests run offline in seconds with no API keys, the evaluation harness scores its 27 labeled cases (clean labels and deliberate defects both) at 100 percent, and the deployed demo measured a median of 3.1 seconds end to end, p95 5.2 paid by the serverless cold start, against the brief's roughly five-second ceiling. The live demo runs a real vision model, so it reads any label photo, and the verify screen loads a bundled sample pair with one click; that front-and-back sample reads in six to nine seconds live, the price of the dense two-image path.</w:t>
+        <w:t xml:space="preserve">One asymmetry runs through the whole design: an unnecessary review costs an agent a few minutes, while a false approval costs trust in the tool. So uncertainty always routes to a person, and the build fails if approve precision drops below 98 percent on the labeled evaluation cases. The numbers I held myself to: 811 tests run offline in seconds with no API keys, the evaluation harness scores its 27 labeled cases (clean labels and deliberate defects both) at 100 percent, and the deployed demo measured a median of 3.1 seconds end to end, p95 5.2 paid by the serverless cold start, against the brief's roughly five-second ceiling. The live demo runs a real vision model, so it reads any label photo, and the verify screen loads a bundled sample pair with one click; that front-and-back sample reads in six to nine seconds live, the price of the dense two-image path.</w:t>
       </w:r>
     </w:p>
     <w:p>
@@ -290,7 +290,7 @@
           <w:sz w:val="22"/>
           <w:szCs w:val="22"/>
         </w:rPr>
-        <w:t xml:space="preserve">The whole suite is offline and deterministic. The default provider is a mock keyed off fixture filenames, so the 810 tests in 63 files and the 27-case evaluation run in seconds with zero keys, and CI runs the same gate (typecheck, lint, test, eval, build) on every push to main. The eval is a gate, not a report: clean labels plus deliberately broken ones (a title-case warning, an out-of-tolerance ABV, a brand typo, a missing warning, an unreadable photo that must never auto-approve), with the build failing under a 98 percent approve-precision floor.</w:t>
+        <w:t xml:space="preserve">The whole suite is offline and deterministic. The default provider is a mock keyed off fixture filenames, so the 811 tests in 63 files and the 27-case evaluation run in seconds with zero keys, and CI runs the same gate (typecheck, lint, test, eval, build) on every push to main. The eval is a gate, not a report: clean labels plus deliberately broken ones (a title-case warning, an out-of-tolerance ABV, a brand typo, a missing warning, an unreadable photo that must never auto-approve), with the build failing under a 98 percent approve-precision floor.</w:t>
       </w:r>
     </w:p>
     <w:p>

</xml_diff>

<commit_message>
docs: sync the test count to the warning-message fix - 817
README and the approach document carried 811; the combined-prefix
messaging landed six tests. TEST_COUNT bumped, docx regenerated,
PDF re-exported, still three pages.

Co-Authored-By: Claude Fable 5 <noreply@anthropic.com>
</commit_message>
<xml_diff>
--- a/docs/TTB-Label-Verifier-Approach-and-Design.docx
+++ b/docs/TTB-Label-Verifier-Approach-and-Design.docx
@@ -53,7 +53,7 @@
         </w:rPr>
         <w:t xml:space="preserve">   ·   June 2026   ·   </w:t>
       </w:r>
-      <w:hyperlink w:history="1" r:id="rIdoka9lecyaltk1o8vmnt6b">
+      <w:hyperlink w:history="1" r:id="rIds_4v42jbn9wphqkish7lj">
         <w:r>
           <w:rPr>
             <w:rStyle w:val="Hyperlink"/>
@@ -70,7 +70,7 @@
         </w:rPr>
         <w:t xml:space="preserve">   ·   </w:t>
       </w:r>
-      <w:hyperlink w:history="1" r:id="rIdmepphlisgca8qclcipkdf">
+      <w:hyperlink w:history="1" r:id="rIdmur9k9vox7ynezxzjgbfw">
         <w:r>
           <w:rPr>
             <w:rStyle w:val="Hyperlink"/>
@@ -122,7 +122,7 @@
           <w:sz w:val="22"/>
           <w:szCs w:val="22"/>
         </w:rPr>
-        <w:t xml:space="preserve">Three numbers tell you most of the story. The test suite is 811 tests, and it runs offline in a few seconds with no API keys, so anyone can verify the behavior on a laptop. The evaluation gate in CI fails the build if precision on approvals drops below 98 percent across 27 labeled cases; it scores 100 today. I set that gate because the two kinds of mistake are not equal: sending a fine label to review wastes minutes, while quietly approving a bad one would sink the tool's credibility. And speed: the deployed demo answers in a median of 3.1 seconds against the brief's rough five-second limit; the slowest of fifteen measured reads took 5.2, and that was the first one, while the server was still waking up. The bundled sample runs longer: six to nine seconds clean, because it is a front-and-back pair with twice the label to read, and about thirteen with the defect, because the tool takes one extra zoomed look at the warning before committing to a hard Reject.</w:t>
+        <w:t xml:space="preserve">Three numbers tell you most of the story. The test suite is 817 tests, and it runs offline in a few seconds with no API keys, so anyone can verify the behavior on a laptop. The evaluation gate in CI fails the build if precision on approvals drops below 98 percent across 27 labeled cases; it scores 100 today. I set that gate because the two kinds of mistake are not equal: sending a fine label to review wastes minutes, while quietly approving a bad one would sink the tool's credibility. And speed: the deployed demo answers in a median of 3.1 seconds against the brief's rough five-second limit; the slowest of fifteen measured reads took 5.2, and that was the first one, while the server was still waking up. The bundled sample runs longer: six to nine seconds clean, because it is a front-and-back pair with twice the label to read, and about thirteen with the defect, because the tool takes one extra zoomed look at the warning before committing to a hard Reject.</w:t>
       </w:r>
     </w:p>
     <w:p>
@@ -346,7 +346,7 @@
           <w:sz w:val="22"/>
           <w:szCs w:val="22"/>
         </w:rPr>
-        <w:t xml:space="preserve">The default AI provider is a mock that recognizes the bundled test images, which means the 811 tests in 63 files and the 27-label evaluation run in seconds, deterministically, with no keys and no network. CI runs the identical gate on every push to main: types, lint, tests, evaluation, build. Clone the repo, run npm test, and the whole pipeline proves itself on your machine before you ever add an API key.</w:t>
+        <w:t xml:space="preserve">The default AI provider is a mock that recognizes the bundled test images, which means the 817 tests in 63 files and the 27-label evaluation run in seconds, deterministically, with no keys and no network. CI runs the identical gate on every push to main: types, lint, tests, evaluation, build. Clone the repo, run npm test, and the whole pipeline proves itself on your machine before you ever add an API key.</w:t>
       </w:r>
     </w:p>
     <w:p>

</xml_diff>

<commit_message>
docs: sync the suite counts to the new controls - 826 in 64
README and the approach document carried 817/63; back to top and
start over landed nine tests in a new file. Counts bumped, docx
regenerated, PDF re-exported, still three pages.

Co-Authored-By: Claude Fable 5 <noreply@anthropic.com>
</commit_message>
<xml_diff>
--- a/docs/TTB-Label-Verifier-Approach-and-Design.docx
+++ b/docs/TTB-Label-Verifier-Approach-and-Design.docx
@@ -53,7 +53,7 @@
         </w:rPr>
         <w:t xml:space="preserve">   ·   June 2026   ·   </w:t>
       </w:r>
-      <w:hyperlink w:history="1" r:id="rIds_4v42jbn9wphqkish7lj">
+      <w:hyperlink w:history="1" r:id="rIdvfoufcaj2aj3mhmbfehff">
         <w:r>
           <w:rPr>
             <w:rStyle w:val="Hyperlink"/>
@@ -70,7 +70,7 @@
         </w:rPr>
         <w:t xml:space="preserve">   ·   </w:t>
       </w:r>
-      <w:hyperlink w:history="1" r:id="rIdmur9k9vox7ynezxzjgbfw">
+      <w:hyperlink w:history="1" r:id="rIdctn5zqe9axrp5hr5mvmbl">
         <w:r>
           <w:rPr>
             <w:rStyle w:val="Hyperlink"/>
@@ -122,7 +122,7 @@
           <w:sz w:val="22"/>
           <w:szCs w:val="22"/>
         </w:rPr>
-        <w:t xml:space="preserve">Three numbers tell you most of the story. The test suite is 817 tests, and it runs offline in a few seconds with no API keys, so anyone can verify the behavior on a laptop. The evaluation gate in CI fails the build if precision on approvals drops below 98 percent across 27 labeled cases; it scores 100 today. I set that gate because the two kinds of mistake are not equal: sending a fine label to review wastes minutes, while quietly approving a bad one would sink the tool's credibility. And speed: the deployed demo answers in a median of 3.1 seconds against the brief's rough five-second limit; the slowest of fifteen measured reads took 5.2, and that was the first one, while the server was still waking up. The bundled sample runs longer: six to nine seconds clean, because it is a front-and-back pair with twice the label to read, and about thirteen with the defect, because the tool takes one extra zoomed look at the warning before committing to a hard Reject.</w:t>
+        <w:t xml:space="preserve">Three numbers tell you most of the story. The test suite is 826 tests, and it runs offline in a few seconds with no API keys, so anyone can verify the behavior on a laptop. The evaluation gate in CI fails the build if precision on approvals drops below 98 percent across 27 labeled cases; it scores 100 today. I set that gate because the two kinds of mistake are not equal: sending a fine label to review wastes minutes, while quietly approving a bad one would sink the tool's credibility. And speed: the deployed demo answers in a median of 3.1 seconds against the brief's rough five-second limit; the slowest of fifteen measured reads took 5.2, and that was the first one, while the server was still waking up. The bundled sample runs longer: six to nine seconds clean, because it is a front-and-back pair with twice the label to read, and about thirteen with the defect, because the tool takes one extra zoomed look at the warning before committing to a hard Reject.</w:t>
       </w:r>
     </w:p>
     <w:p>
@@ -346,7 +346,7 @@
           <w:sz w:val="22"/>
           <w:szCs w:val="22"/>
         </w:rPr>
-        <w:t xml:space="preserve">The default AI provider is a mock that recognizes the bundled test images, which means the 817 tests in 63 files and the 27-label evaluation run in seconds, deterministically, with no keys and no network. CI runs the identical gate on every push to main: types, lint, tests, evaluation, build. Clone the repo, run npm test, and the whole pipeline proves itself on your machine before you ever add an API key.</w:t>
+        <w:t xml:space="preserve">The default AI provider is a mock that recognizes the bundled test images, which means the 826 tests in 64 files and the 27-label evaluation run in seconds, deterministically, with no keys and no network. CI runs the identical gate on every push to main: types, lint, tests, evaluation, build. Clone the repo, run npm test, and the whole pipeline proves itself on your machine before you ever add an API key.</w:t>
       </w:r>
     </w:p>
     <w:p>

</xml_diff>

<commit_message>
docs: sync the suite count to the field fixes - 839
Co-Authored-By: Claude Fable 5 <noreply@anthropic.com>
</commit_message>
<xml_diff>
--- a/docs/TTB-Label-Verifier-Approach-and-Design.docx
+++ b/docs/TTB-Label-Verifier-Approach-and-Design.docx
@@ -53,7 +53,7 @@
         </w:rPr>
         <w:t xml:space="preserve">   ·   June 2026   ·   </w:t>
       </w:r>
-      <w:hyperlink w:history="1" r:id="rIdvfoufcaj2aj3mhmbfehff">
+      <w:hyperlink w:history="1" r:id="rId_bic8b32st7t963gs6kjf">
         <w:r>
           <w:rPr>
             <w:rStyle w:val="Hyperlink"/>
@@ -70,7 +70,7 @@
         </w:rPr>
         <w:t xml:space="preserve">   ·   </w:t>
       </w:r>
-      <w:hyperlink w:history="1" r:id="rIdctn5zqe9axrp5hr5mvmbl">
+      <w:hyperlink w:history="1" r:id="rId7nbjejtj8vpoxzoasnrbb">
         <w:r>
           <w:rPr>
             <w:rStyle w:val="Hyperlink"/>
@@ -122,7 +122,7 @@
           <w:sz w:val="22"/>
           <w:szCs w:val="22"/>
         </w:rPr>
-        <w:t xml:space="preserve">Three numbers tell you most of the story. The test suite is 826 tests, and it runs offline in a few seconds with no API keys, so anyone can verify the behavior on a laptop. The evaluation gate in CI fails the build if precision on approvals drops below 98 percent across 27 labeled cases; it scores 100 today. I set that gate because the two kinds of mistake are not equal: sending a fine label to review wastes minutes, while quietly approving a bad one would sink the tool's credibility. And speed: the deployed demo answers in a median of 3.1 seconds against the brief's rough five-second limit; the slowest of fifteen measured reads took 5.2, and that was the first one, while the server was still waking up. The bundled sample runs longer: six to nine seconds clean, because it is a front-and-back pair with twice the label to read, and about thirteen with the defect, because the tool takes one extra zoomed look at the warning before committing to a hard Reject.</w:t>
+        <w:t xml:space="preserve">Three numbers tell you most of the story. The test suite is 839 tests, and it runs offline in a few seconds with no API keys, so anyone can verify the behavior on a laptop. The evaluation gate in CI fails the build if precision on approvals drops below 98 percent across 27 labeled cases; it scores 100 today. I set that gate because the two kinds of mistake are not equal: sending a fine label to review wastes minutes, while quietly approving a bad one would sink the tool's credibility. And speed: the deployed demo answers in a median of 3.1 seconds against the brief's rough five-second limit; the slowest of fifteen measured reads took 5.2, and that was the first one, while the server was still waking up. The bundled sample runs longer: six to nine seconds clean, because it is a front-and-back pair with twice the label to read, and about thirteen with the defect, because the tool takes one extra zoomed look at the warning before committing to a hard Reject.</w:t>
       </w:r>
     </w:p>
     <w:p>
@@ -346,7 +346,7 @@
           <w:sz w:val="22"/>
           <w:szCs w:val="22"/>
         </w:rPr>
-        <w:t xml:space="preserve">The default AI provider is a mock that recognizes the bundled test images, which means the 826 tests in 64 files and the 27-label evaluation run in seconds, deterministically, with no keys and no network. CI runs the identical gate on every push to main: types, lint, tests, evaluation, build. Clone the repo, run npm test, and the whole pipeline proves itself on your machine before you ever add an API key.</w:t>
+        <w:t xml:space="preserve">The default AI provider is a mock that recognizes the bundled test images, which means the 839 tests in 64 files and the 27-label evaluation run in seconds, deterministically, with no keys and no network. CI runs the identical gate on every push to main: types, lint, tests, evaluation, build. Clone the repo, run npm test, and the whole pipeline proves itself on your machine before you ever add an API key.</w:t>
       </w:r>
     </w:p>
     <w:p>

</xml_diff>